<commit_message>
Valores digitados só com números, centavos nos dois últimos dígitos, como no SIAFI
Co-Authored-By: Claude Opus 5.5 <noreply@anthropic.com>
Claude-Session: https://claude.ai/code/session_017WkAoUekkvr4DuFbwx2atn
</commit_message>
<xml_diff>
--- a/treinamento-siafi/Especificacoes_de_Empenho_Ficticias.docx
+++ b/treinamento-siafi/Especificacoes_de_Empenho_Ficticias.docx
@@ -118,6 +118,24 @@
           <w:szCs w:val="19"/>
         </w:rPr>
         <w:t xml:space="preserve">O item 8 de cada caso é o gabarito. Confira o resultado só depois de fazer o lançamento.</w:t>
+      </w:r>
+    </w:p>
+    <w:p>
+      <w:pPr>
+        <w:pStyle w:val="ListParagraph"/>
+        <w:numPr>
+          <w:ilvl w:val="0"/>
+          <w:numId w:val="2"/>
+        </w:numPr>
+        <w:spacing w:after="60"/>
+      </w:pPr>
+      <w:r>
+        <w:rPr>
+          <w:rFonts w:ascii="Arial" w:cs="Arial" w:eastAsia="Arial" w:hAnsi="Arial"/>
+          <w:sz w:val="19"/>
+          <w:szCs w:val="19"/>
+        </w:rPr>
+        <w:t xml:space="preserve">Valores no SIAFI: digite só números, sem ponto nem vírgula. Os dois últimos dígitos são os centavos (R$ 12.000,00 = 1200000).</w:t>
       </w:r>
     </w:p>
     <w:p>
@@ -1916,7 +1934,7 @@
                 <w:sz w:val="19"/>
                 <w:szCs w:val="19"/>
               </w:rPr>
-              <w:t xml:space="preserve">R$ 12.000,00</w:t>
+              <w:t xml:space="preserve">R$ 12.000,00 (no SIAFI: 1200000)</w:t>
             </w:r>
           </w:p>
         </w:tc>
@@ -3957,7 +3975,7 @@
                 <w:sz w:val="19"/>
                 <w:szCs w:val="19"/>
               </w:rPr>
-              <w:t xml:space="preserve">R$ 12.000,00 (nota integral)</w:t>
+              <w:t xml:space="preserve">R$ 12.000,00 (no SIAFI: 1200000)</w:t>
             </w:r>
           </w:p>
         </w:tc>
@@ -4769,7 +4787,7 @@
                 <w:sz w:val="19"/>
                 <w:szCs w:val="19"/>
               </w:rPr>
-              <w:t xml:space="preserve">R$ 9.504,00</w:t>
+              <w:t xml:space="preserve">R$ 9.504,00 (no SIAFI: 950400)</w:t>
             </w:r>
           </w:p>
         </w:tc>
@@ -6568,7 +6586,7 @@
                 <w:sz w:val="19"/>
                 <w:szCs w:val="19"/>
               </w:rPr>
-              <w:t xml:space="preserve">R$ 4.800,00</w:t>
+              <w:t xml:space="preserve">R$ 4.800,00 (no SIAFI: 480000)</w:t>
             </w:r>
           </w:p>
         </w:tc>
@@ -8803,7 +8821,7 @@
                 <w:sz w:val="19"/>
                 <w:szCs w:val="19"/>
               </w:rPr>
-              <w:t xml:space="preserve">R$ 2.400,00 (só a nota, não o empenho todo)</w:t>
+              <w:t xml:space="preserve">R$ 2.400,00, só a nota (no SIAFI: 240000)</w:t>
             </w:r>
           </w:p>
         </w:tc>
@@ -9548,7 +9566,7 @@
                 <w:sz w:val="19"/>
                 <w:szCs w:val="19"/>
               </w:rPr>
-              <w:t xml:space="preserve">R$ 2.371,20</w:t>
+              <w:t xml:space="preserve">R$ 2.371,20 (no SIAFI: 237120)</w:t>
             </w:r>
           </w:p>
         </w:tc>

</xml_diff>

<commit_message>
Simulador: uma linha por evento de retenção (INSS em previdenciários, ISS em outras retenções)
Co-Authored-By: Claude Opus 5.5 <noreply@anthropic.com>
Claude-Session: https://claude.ai/code/session_017WkAoUekkvr4DuFbwx2atn
</commit_message>
<xml_diff>
--- a/treinamento-siafi/Especificacoes_de_Empenho_Ficticias.docx
+++ b/treinamento-siafi/Especificacoes_de_Empenho_Ficticias.docx
@@ -3444,6 +3444,24 @@
     </w:p>
     <w:p>
       <w:pPr>
+        <w:pStyle w:val="ListParagraph"/>
+        <w:numPr>
+          <w:ilvl w:val="0"/>
+          <w:numId w:val="2"/>
+        </w:numPr>
+        <w:spacing w:after="60"/>
+      </w:pPr>
+      <w:r>
+        <w:rPr>
+          <w:rFonts w:ascii="Arial" w:cs="Arial" w:eastAsia="Arial" w:hAnsi="Arial"/>
+          <w:sz w:val="19"/>
+          <w:szCs w:val="19"/>
+        </w:rPr>
+        <w:t xml:space="preserve">Tela de eventos de retenção: 1 em CONTRIBUIÇÃO/RETENÇÃO/DESCONTOS PREVIDENCIÁRIOS (INSS) e 1 em OUTRAS RETENÇÕES (ISS). O IRRF não tem linha: o sistema aplica sozinho, código 6256.</w:t>
+      </w:r>
+    </w:p>
+    <w:p>
+      <w:pPr>
         <w:spacing w:after="120"/>
       </w:pPr>
     </w:p>
@@ -8286,6 +8304,24 @@
           <w:szCs w:val="19"/>
         </w:rPr>
         <w:t xml:space="preserve">Material não sofre ISS nem INSS. Na liquidação incide só o IRRF (1,2%).</w:t>
+      </w:r>
+    </w:p>
+    <w:p>
+      <w:pPr>
+        <w:pStyle w:val="ListParagraph"/>
+        <w:numPr>
+          <w:ilvl w:val="0"/>
+          <w:numId w:val="2"/>
+        </w:numPr>
+        <w:spacing w:after="60"/>
+      </w:pPr>
+      <w:r>
+        <w:rPr>
+          <w:rFonts w:ascii="Arial" w:cs="Arial" w:eastAsia="Arial" w:hAnsi="Arial"/>
+          <w:sz w:val="19"/>
+          <w:szCs w:val="19"/>
+        </w:rPr>
+        <w:t xml:space="preserve">Tela de eventos de retenção: deixe todas as linhas em branco. O IRRF não tem linha: o sistema aplica sozinho, código 6256.</w:t>
       </w:r>
     </w:p>
     <w:p>

</xml_diff>